<commit_message>
Add selective Major Concerns and editable Word wrapping
</commit_message>
<xml_diff>
--- a/skills/minxin-subject-sow-planner/assets/minxin-subject-sow-template.docx
+++ b/skills/minxin-subject-sow-planner/assets/minxin-subject-sow-template.docx
@@ -29,6 +29,8 @@
           <w:p>
             <w:pPr>
               <w:jc w:val="center"/>
+              <w:wordWrap w:val="1"/>
+              <w:suppressAutoHyphens w:val="1"/>
             </w:pPr>
             <w:r>
               <w:drawing>
@@ -74,6 +76,8 @@
             <w:pPr>
               <w:spacing w:after="20"/>
               <w:jc w:val="center"/>
+              <w:wordWrap w:val="1"/>
+              <w:suppressAutoHyphens w:val="1"/>
             </w:pPr>
             <w:r>
               <w:rPr>
@@ -92,6 +96,8 @@
       <w:pPr>
         <w:spacing w:before="0" w:after="100"/>
         <w:jc w:val="center"/>
+        <w:wordWrap w:val="1"/>
+        <w:suppressAutoHyphens w:val="1"/>
       </w:pPr>
       <w:r>
         <w:rPr>
@@ -100,7 +106,7 @@
           <w:color w:val="000000"/>
           <w:sz w:val="21"/>
         </w:rPr>
-        <w:t>Course: SUBJECT-GRADE-LEVEL-CLASS | Level/Class: Level / Class</w:t>
+        <w:t>Course: SUBJECT-GRADE-LEVEL-CLASS | Level/​Class: Level /​ Class</w:t>
       </w:r>
     </w:p>
     <w:tbl>
@@ -145,6 +151,8 @@
             <w:pPr>
               <w:spacing w:after="0"/>
               <w:jc w:val="center"/>
+              <w:wordWrap w:val="1"/>
+              <w:suppressAutoHyphens w:val="1"/>
             </w:pPr>
             <w:r>
               <w:rPr>
@@ -173,6 +181,8 @@
             <w:pPr>
               <w:spacing w:after="0"/>
               <w:jc w:val="center"/>
+              <w:wordWrap w:val="1"/>
+              <w:suppressAutoHyphens w:val="1"/>
             </w:pPr>
             <w:r>
               <w:rPr>
@@ -201,6 +211,8 @@
             <w:pPr>
               <w:spacing w:after="0"/>
               <w:jc w:val="center"/>
+              <w:wordWrap w:val="1"/>
+              <w:suppressAutoHyphens w:val="1"/>
             </w:pPr>
             <w:r>
               <w:rPr>
@@ -229,6 +241,8 @@
             <w:pPr>
               <w:spacing w:after="0"/>
               <w:jc w:val="center"/>
+              <w:wordWrap w:val="1"/>
+              <w:suppressAutoHyphens w:val="1"/>
             </w:pPr>
             <w:r>
               <w:rPr>
@@ -257,6 +271,8 @@
             <w:pPr>
               <w:spacing w:after="0"/>
               <w:jc w:val="center"/>
+              <w:wordWrap w:val="1"/>
+              <w:suppressAutoHyphens w:val="1"/>
             </w:pPr>
             <w:r>
               <w:rPr>
@@ -285,6 +301,8 @@
             <w:pPr>
               <w:spacing w:after="0"/>
               <w:jc w:val="center"/>
+              <w:wordWrap w:val="1"/>
+              <w:suppressAutoHyphens w:val="1"/>
             </w:pPr>
             <w:r>
               <w:rPr>
@@ -313,6 +331,8 @@
             <w:pPr>
               <w:spacing w:after="0"/>
               <w:jc w:val="center"/>
+              <w:wordWrap w:val="1"/>
+              <w:suppressAutoHyphens w:val="1"/>
             </w:pPr>
             <w:r>
               <w:rPr>
@@ -341,6 +361,8 @@
             <w:pPr>
               <w:spacing w:after="0"/>
               <w:jc w:val="center"/>
+              <w:wordWrap w:val="1"/>
+              <w:suppressAutoHyphens w:val="1"/>
             </w:pPr>
             <w:r>
               <w:rPr>
@@ -369,6 +391,8 @@
             <w:pPr>
               <w:spacing w:after="0"/>
               <w:jc w:val="center"/>
+              <w:wordWrap w:val="1"/>
+              <w:suppressAutoHyphens w:val="1"/>
             </w:pPr>
             <w:r>
               <w:rPr>
@@ -397,6 +421,8 @@
             <w:pPr>
               <w:spacing w:after="0"/>
               <w:jc w:val="center"/>
+              <w:wordWrap w:val="1"/>
+              <w:suppressAutoHyphens w:val="1"/>
             </w:pPr>
             <w:r>
               <w:rPr>
@@ -425,6 +451,8 @@
             <w:pPr>
               <w:spacing w:after="0"/>
               <w:jc w:val="center"/>
+              <w:wordWrap w:val="1"/>
+              <w:suppressAutoHyphens w:val="1"/>
             </w:pPr>
             <w:r>
               <w:rPr>
@@ -455,6 +483,8 @@
           </w:tcPr>
           <w:p>
             <w:pPr>
+              <w:wordWrap w:val="1"/>
+              <w:suppressAutoHyphens w:val="1"/>
               <w:spacing w:before="0" w:after="0" w:line="221" w:lineRule="auto"/>
               <w:jc w:val="center"/>
             </w:pPr>
@@ -482,6 +512,8 @@
           </w:tcPr>
           <w:p>
             <w:pPr>
+              <w:wordWrap w:val="1"/>
+              <w:suppressAutoHyphens w:val="1"/>
               <w:spacing w:before="0" w:after="0" w:line="221" w:lineRule="auto"/>
               <w:jc w:val="center"/>
             </w:pPr>
@@ -509,6 +541,8 @@
           </w:tcPr>
           <w:p>
             <w:pPr>
+              <w:wordWrap w:val="1"/>
+              <w:suppressAutoHyphens w:val="1"/>
               <w:spacing w:before="0" w:after="0" w:line="221" w:lineRule="auto"/>
             </w:pPr>
             <w:r>
@@ -535,6 +569,8 @@
           </w:tcPr>
           <w:p>
             <w:pPr>
+              <w:wordWrap w:val="1"/>
+              <w:suppressAutoHyphens w:val="1"/>
               <w:spacing w:before="0" w:after="0" w:line="221" w:lineRule="auto"/>
             </w:pPr>
             <w:r>
@@ -561,6 +597,8 @@
           </w:tcPr>
           <w:p>
             <w:pPr>
+              <w:wordWrap w:val="1"/>
+              <w:suppressAutoHyphens w:val="1"/>
               <w:spacing w:before="0" w:after="0" w:line="221" w:lineRule="auto"/>
             </w:pPr>
             <w:r>
@@ -587,6 +625,8 @@
           </w:tcPr>
           <w:p>
             <w:pPr>
+              <w:wordWrap w:val="1"/>
+              <w:suppressAutoHyphens w:val="1"/>
               <w:spacing w:before="0" w:after="0" w:line="221" w:lineRule="auto"/>
             </w:pPr>
             <w:r>
@@ -613,6 +653,8 @@
           </w:tcPr>
           <w:p>
             <w:pPr>
+              <w:wordWrap w:val="1"/>
+              <w:suppressAutoHyphens w:val="1"/>
               <w:spacing w:before="0" w:after="0" w:line="221" w:lineRule="auto"/>
               <w:jc w:val="center"/>
             </w:pPr>
@@ -640,6 +682,8 @@
           </w:tcPr>
           <w:p>
             <w:pPr>
+              <w:wordWrap w:val="1"/>
+              <w:suppressAutoHyphens w:val="1"/>
               <w:spacing w:before="0" w:after="0" w:line="221" w:lineRule="auto"/>
             </w:pPr>
             <w:r>
@@ -666,6 +710,8 @@
           </w:tcPr>
           <w:p>
             <w:pPr>
+              <w:wordWrap w:val="1"/>
+              <w:suppressAutoHyphens w:val="1"/>
               <w:spacing w:before="0" w:after="0" w:line="221" w:lineRule="auto"/>
             </w:pPr>
             <w:r>
@@ -692,6 +738,8 @@
           </w:tcPr>
           <w:p>
             <w:pPr>
+              <w:wordWrap w:val="1"/>
+              <w:suppressAutoHyphens w:val="1"/>
               <w:spacing w:before="0" w:after="0" w:line="221" w:lineRule="auto"/>
             </w:pPr>
             <w:r>
@@ -718,6 +766,8 @@
           </w:tcPr>
           <w:p>
             <w:pPr>
+              <w:wordWrap w:val="1"/>
+              <w:suppressAutoHyphens w:val="1"/>
               <w:spacing w:before="0" w:after="0" w:line="221" w:lineRule="auto"/>
             </w:pPr>
             <w:r>
@@ -727,16 +777,101 @@
                 <w:color w:val="000000"/>
                 <w:sz w:val="14"/>
               </w:rPr>
-              <w:t>Evidence: Observable evidence</w:t>
-              <w:br/>
-              <w:t>Assessment for/as/of learning</w:t>
-              <w:br/>
-              <w:t>Feedback/revision: Feedback and revision action</w:t>
+              <w:t>Evidence: Observable evidence Assessment for/​as/​of learning Feedback/​revision: Feedback and revision action</w:t>
             </w:r>
           </w:p>
         </w:tc>
       </w:tr>
     </w:tbl>
+    <w:p>
+      <w:pPr>
+        <w:keepNext/>
+        <w:spacing w:before="120" w:after="40"/>
+        <w:wordWrap w:val="1"/>
+        <w:suppressAutoHyphens w:val="1"/>
+      </w:pPr>
+      <w:r>
+        <w:rPr>
+          <w:rFonts w:ascii="Times New Roman" w:hAnsi="Times New Roman" w:eastAsia="Microsoft JhengHei"/>
+          <w:b/>
+          <w:color w:val="000000"/>
+          <w:sz w:val="18"/>
+        </w:rPr>
+        <w:t>Remarks: Major Concerns (2025–2028)</w:t>
+      </w:r>
+    </w:p>
+    <w:p>
+      <w:pPr>
+        <w:keepNext/>
+        <w:keepLines/>
+        <w:spacing w:before="0" w:after="20"/>
+        <w:wordWrap w:val="1"/>
+        <w:suppressAutoHyphens w:val="1"/>
+      </w:pPr>
+      <w:r>
+        <w:rPr>
+          <w:rFonts w:ascii="Times New Roman" w:hAnsi="Times New Roman" w:eastAsia="Microsoft JhengHei"/>
+          <w:b w:val="0"/>
+          <w:color w:val="000000"/>
+          <w:sz w:val="15"/>
+        </w:rPr>
+        <w:t>M1: To enhance global engagement and innovation by deepening partnerships and integrating future-ready, AI-driven teaching practices, thereby building a smart campus and nurturing AI-literate students.</w:t>
+      </w:r>
+    </w:p>
+    <w:p>
+      <w:pPr>
+        <w:keepNext/>
+        <w:keepLines/>
+        <w:spacing w:before="0" w:after="20"/>
+        <w:wordWrap w:val="1"/>
+        <w:suppressAutoHyphens w:val="1"/>
+      </w:pPr>
+      <w:r>
+        <w:rPr>
+          <w:rFonts w:ascii="Times New Roman" w:hAnsi="Times New Roman" w:eastAsia="Microsoft JhengHei"/>
+          <w:b w:val="0"/>
+          <w:color w:val="000000"/>
+          <w:sz w:val="15"/>
+        </w:rPr>
+        <w:t>M2: To promote high quality teaching and academic excellence through research-informed practice, interdisciplinary collaboration, and continuous pedagogical innovation.</w:t>
+      </w:r>
+    </w:p>
+    <w:p>
+      <w:pPr>
+        <w:keepNext/>
+        <w:keepLines/>
+        <w:spacing w:before="0" w:after="20"/>
+        <w:wordWrap w:val="1"/>
+        <w:suppressAutoHyphens w:val="1"/>
+      </w:pPr>
+      <w:r>
+        <w:rPr>
+          <w:rFonts w:ascii="Times New Roman" w:hAnsi="Times New Roman" w:eastAsia="Microsoft JhengHei"/>
+          <w:b w:val="0"/>
+          <w:color w:val="000000"/>
+          <w:sz w:val="15"/>
+        </w:rPr>
+        <w:t>M3: To foster students’ holistic development and global outlook by deepening Values Education, developing ATL skills and expanding meaningful leadership opportunities.</w:t>
+      </w:r>
+    </w:p>
+    <w:p>
+      <w:pPr>
+        <w:keepLines/>
+        <w:spacing w:before="20" w:after="0"/>
+        <w:wordWrap w:val="1"/>
+        <w:suppressAutoHyphens w:val="1"/>
+      </w:pPr>
+      <w:r>
+        <w:rPr>
+          <w:rFonts w:ascii="Times New Roman" w:hAnsi="Times New Roman" w:eastAsia="Microsoft JhengHei"/>
+          <w:b w:val="0"/>
+          <w:i/>
+          <w:color w:val="000000"/>
+          <w:sz w:val="15"/>
+        </w:rPr>
+        <w:t>Planning note: Cite M1–M3 in Learning Objectives only where a direct, evidence-based alignment exists; they are not weekly labels.</w:t>
+      </w:r>
+    </w:p>
     <w:sectPr>
       <w:footerReference w:type="default" r:id="rId9"/>
       <w:pgSz w:w="16838" w:h="11906" w:orient="landscape"/>
@@ -754,6 +889,8 @@
     <w:pPr>
       <w:pStyle w:val="Footer"/>
       <w:jc w:val="right"/>
+      <w:wordWrap w:val="1"/>
+      <w:suppressAutoHyphens w:val="1"/>
     </w:pPr>
     <w:r>
       <w:rPr>

</xml_diff>